<commit_message>
Emphasize audit trail, Status Trail export, and no record ceiling
Users' most frequent SharePoint complaint was not being able to see who
edited a record, so give the audit trail top billing in Background and
Audit Logs rather than treating it as one item among three.

Document the Status Trail export (per-status "ever held" counts, e.g. a
record that was Pending and is now Scheduled counts under both) as a
direct implementation of a specific request from Logistics, in the
README's Audit Logs and Exporting System sections, the glossary, and
the Word documentation.

Also state plainly that the new Postgres-backed system has no
equivalent to SharePoint's 5,000-item view ceiling, rather than just
implying it.
</commit_message>
<xml_diff>
--- a/Desktop/Supply Chain/docs/Microgenesis-Supply-Chain-Portal-Documentation.docx
+++ b/Desktop/Supply Chain/docs/Microgenesis-Supply-Chain-Portal-Documentation.docx
@@ -154,7 +154,7 @@
         <w:spacing w:after="160"/>
       </w:pPr>
       <w:r>
-        <w:t xml:space="preserve">The existing AS-IS system is a Microsoft SharePoint List that Microgenesis uses to track deliveries, returns, collections, and pick-ups. This portal replaces it to fix three confirmed pain points:</w:t>
+        <w:t xml:space="preserve">The existing AS-IS system is a Microsoft SharePoint List that Microgenesis uses to track deliveries, returns, collections, and pick-ups. This portal replaces it to fix three confirmed pain points — the first two were direct, repeated user complaints, not just an engineering assessment:</w:t>
       </w:r>
     </w:p>
     <w:p>
@@ -171,10 +171,10 @@
           <w:b/>
           <w:bCs/>
         </w:rPr>
-        <w:t xml:space="preserve">No audit trail. </w:t>
-      </w:r>
-      <w:r>
-        <w:t xml:space="preserve">There was no reliable record of who created or last modified an entry.</w:t>
+        <w:t xml:space="preserve">No audit trail — by far the most frequent user complaint. </w:t>
+      </w:r>
+      <w:r>
+        <w:t xml:space="preserve">There was no reliable record of who created or last modified an entry. Users repeatedly reported that when a delivery date changed or a status was disputed, there was no way to answer “who did this, and when” without manually asking around the office. See Section 6 for how this is fixed, including the Status Trail export built specifically at Logistics' request.</w:t>
       </w:r>
     </w:p>
     <w:p>
@@ -211,10 +211,10 @@
           <w:b/>
           <w:bCs/>
         </w:rPr>
-        <w:t xml:space="preserve">A hard record-count ceiling. </w:t>
-      </w:r>
-      <w:r>
-        <w:t xml:space="preserve">SharePoint's 5,000-item list view threshold caused recurring operational stoppages.</w:t>
+        <w:t xml:space="preserve">A hard record-count ceiling — solved, not just mitigated. </w:t>
+      </w:r>
+      <w:r>
+        <w:t xml:space="preserve">SharePoint's 5,000-item list view threshold caused recurring operational stoppages, requiring a support ticket to keep working. The new portal runs on a real PostgreSQL database with no equivalent item-count ceiling: no 5,000-row wall, no support ticket, and no view that silently stops showing data as the operation grows.</w:t>
       </w:r>
     </w:p>
     <w:p>
@@ -2257,6 +2257,62 @@
         <w:t xml:space="preserve">Every export is generated directly from the live database record, so the exported document and the system's data can never silently drift apart.</w:t>
       </w:r>
     </w:p>
+    <w:tbl>
+      <w:tblPr>
+        <w:tblW w:type="dxa" w:w="9350"/>
+        <w:tblBorders>
+          <w:top w:val="single" w:color="1B5E20" w:sz="4"/>
+          <w:left w:val="single" w:color="1B5E20" w:sz="24"/>
+          <w:bottom w:val="single" w:color="1B5E20" w:sz="4"/>
+          <w:right w:val="single" w:color="1B5E20" w:sz="4"/>
+          <w:insideH w:val="single" w:color="auto" w:sz="4"/>
+          <w:insideV w:val="single" w:color="auto" w:sz="4"/>
+        </w:tblBorders>
+      </w:tblPr>
+      <w:tblGrid>
+        <w:gridCol w:w="9350"/>
+      </w:tblGrid>
+      <w:tr>
+        <w:tc>
+          <w:tcPr>
+            <w:tcW w:type="dxa" w:w="9350"/>
+            <w:shd w:fill="E8F5E9" w:val="clear"/>
+            <w:tcMar>
+              <w:top w:type="dxa" w:w="160"/>
+              <w:left w:type="dxa" w:w="200"/>
+              <w:bottom w:type="dxa" w:w="160"/>
+              <w:right w:type="dxa" w:w="200"/>
+            </w:tcMar>
+          </w:tcPr>
+          <w:p>
+            <w:pPr>
+              <w:spacing w:after="80"/>
+            </w:pPr>
+            <w:r>
+              <w:rPr>
+                <w:b/>
+                <w:bCs/>
+                <w:color w:val="1B5E20"/>
+              </w:rPr>
+              <w:t xml:space="preserve">Status Trail export — built at Logistics' request</w:t>
+            </w:r>
+          </w:p>
+          <w:p>
+            <w:r>
+              <w:rPr>
+                <w:color w:val="333333"/>
+              </w:rPr>
+              <w:t xml:space="preserve">Logistics specifically asked whether an export could reflect a record's full status history — for example, a record that was Pending and is now Scheduled should be countable under BOTH statuses in a report, not just its current one. This is implemented: every export menu offers a Status Trail mode alongside the normal (“Current Status”) export. In Status Trail mode, each record is counted under every status it has ever held, reconstructed from that record's audit history (computeStatusHistoryCounts() in src/utils/export.ts, backed by GET /api/records/status-history-counts). Available in CSV, Excel, Word, and PDF, across every export menu in the app.</w:t>
+            </w:r>
+          </w:p>
+        </w:tc>
+      </w:tr>
+    </w:tbl>
+    <w:p>
+      <w:pPr>
+        <w:spacing w:before="200"/>
+      </w:pPr>
+    </w:p>
     <w:p>
       <w:pPr>
         <w:pStyle w:val="Heading1"/>
@@ -3472,6 +3528,26 @@
       </w:r>
       <w:r>
         <w:t xml:space="preserve">— the configurable panel controlling what happens on a record event; mostly simulated today.</w:t>
+      </w:r>
+    </w:p>
+    <w:p>
+      <w:pPr>
+        <w:pStyle w:val="ListParagraph"/>
+        <w:numPr>
+          <w:ilvl w:val="0"/>
+          <w:numId w:val="2"/>
+        </w:numPr>
+        <w:spacing w:after="80"/>
+      </w:pPr>
+      <w:r>
+        <w:rPr>
+          <w:b/>
+          <w:bCs/>
+        </w:rPr>
+        <w:t xml:space="preserve">Status Trail (export) </w:t>
+      </w:r>
+      <w:r>
+        <w:t xml:space="preserve">— an export mode counting a record under every status it has ever held, not just its current one; built at Logistics' request. See Section 5.</w:t>
       </w:r>
     </w:p>
     <w:p>

</xml_diff>